<commit_message>
Simulationstool mit Tests, Hinweise zur Simulation, dritter Codex-Auftrag (X3), Protokolle Version 12
Co-Authored-By: Claude Opus 5.5 <noreply@anthropic.com>
Claude-Session: https://claude.ai/code/session_01H6HhHh1SmuARGHNzYGswr7
</commit_message>
<xml_diff>
--- a/ergebnisse/kaffee/protokolle/Entscheidungsprotokoll_2026-10-31.docx
+++ b/ergebnisse/kaffee/protokolle/Entscheidungsprotokoll_2026-10-31.docx
@@ -47,7 +47,7 @@
           <w:sz w:val="17"/>
           <w:szCs w:val="17"/>
         </w:rPr>
-        <w:t xml:space="preserve"> 11 · </w:t>
+        <w:t xml:space="preserve"> 12 · </w:t>
       </w:r>
       <w:r>
         <w:rPr>
@@ -7498,6 +7498,148 @@
           </w:p>
         </w:tc>
       </w:tr>
+      <w:tr>
+        <w:trPr>
+          <w:cantSplit/>
+        </w:trPr>
+        <w:tc>
+          <w:tcPr>
+            <w:tcW w:type="dxa" w:w="600"/>
+            <w:tcBorders>
+              <w:top w:val="single" w:color="C9D3EE" w:sz="4"/>
+              <w:left w:val="single" w:color="C9D3EE" w:sz="4"/>
+              <w:bottom w:val="single" w:color="C9D3EE" w:sz="4"/>
+              <w:right w:val="single" w:color="C9D3EE" w:sz="4"/>
+            </w:tcBorders>
+            <w:tcMar>
+              <w:top w:type="dxa" w:w="60"/>
+              <w:left w:type="dxa" w:w="100"/>
+              <w:bottom w:type="dxa" w:w="60"/>
+              <w:right w:type="dxa" w:w="100"/>
+            </w:tcMar>
+            <w:vAlign w:val="top"/>
+          </w:tcPr>
+          <w:p>
+            <w:pPr>
+              <w:keepNext w:val="false"/>
+              <w:spacing w:after="10" w:before="10" w:line="252" w:lineRule="auto"/>
+              <w:jc w:val="left"/>
+            </w:pPr>
+            <w:r>
+              <w:rPr>
+                <w:b/>
+                <w:bCs/>
+                <w:color w:val="0025AA"/>
+                <w:sz w:val="17"/>
+                <w:szCs w:val="17"/>
+              </w:rPr>
+              <w:t xml:space="preserve">G45</w:t>
+            </w:r>
+          </w:p>
+        </w:tc>
+        <w:tc>
+          <w:tcPr>
+            <w:tcW w:type="dxa" w:w="4300"/>
+            <w:tcBorders>
+              <w:top w:val="single" w:color="C9D3EE" w:sz="4"/>
+              <w:left w:val="single" w:color="C9D3EE" w:sz="4"/>
+              <w:bottom w:val="single" w:color="C9D3EE" w:sz="4"/>
+              <w:right w:val="single" w:color="C9D3EE" w:sz="4"/>
+            </w:tcBorders>
+            <w:tcMar>
+              <w:top w:type="dxa" w:w="60"/>
+              <w:left w:type="dxa" w:w="100"/>
+              <w:bottom w:type="dxa" w:w="60"/>
+              <w:right w:type="dxa" w:w="100"/>
+            </w:tcMar>
+            <w:vAlign w:val="top"/>
+          </w:tcPr>
+          <w:p>
+            <w:pPr>
+              <w:keepNext w:val="false"/>
+              <w:spacing w:after="10" w:before="10" w:line="252" w:lineRule="auto"/>
+              <w:jc w:val="left"/>
+            </w:pPr>
+            <w:r>
+              <w:rPr>
+                <w:b w:val="false"/>
+                <w:bCs w:val="false"/>
+                <w:sz w:val="17"/>
+                <w:szCs w:val="17"/>
+              </w:rPr>
+              <w:t xml:space="preserve">Auftrag der Tutoriumsleitung vom 31.10.2026 nach dem Merge von Lukas01D/wue-tutorien#3: Frage 3 (Biot) als Hausaufgabe bestätigt; in allen übrigen Tutorien der Sammlung beschreibende Indizes aufrecht wie beim Kaffee (Ä24), mit Textvergleich; Simulationstool für die dritte Ebene (eine HTML-Datei, offline, Modell aus kaffee_modell.py, Regler nur für Größen des Modells, Messwerte aus dem Versuch, 3 bis 4 Fragen, Testskript und Browsertest); dritter Auftrag für Codex (Rolle X3); neuer Zweig und neuer Pull Request</w:t>
+            </w:r>
+          </w:p>
+        </w:tc>
+        <w:tc>
+          <w:tcPr>
+            <w:tcW w:type="dxa" w:w="600"/>
+            <w:tcBorders>
+              <w:top w:val="single" w:color="C9D3EE" w:sz="4"/>
+              <w:left w:val="single" w:color="C9D3EE" w:sz="4"/>
+              <w:bottom w:val="single" w:color="C9D3EE" w:sz="4"/>
+              <w:right w:val="single" w:color="C9D3EE" w:sz="4"/>
+            </w:tcBorders>
+            <w:tcMar>
+              <w:top w:type="dxa" w:w="60"/>
+              <w:left w:type="dxa" w:w="100"/>
+              <w:bottom w:type="dxa" w:w="60"/>
+              <w:right w:type="dxa" w:w="100"/>
+            </w:tcMar>
+            <w:vAlign w:val="top"/>
+          </w:tcPr>
+          <w:p>
+            <w:pPr>
+              <w:keepNext w:val="false"/>
+              <w:spacing w:after="10" w:before="10" w:line="252" w:lineRule="auto"/>
+              <w:jc w:val="left"/>
+            </w:pPr>
+            <w:r>
+              <w:rPr>
+                <w:b w:val="false"/>
+                <w:bCs w:val="false"/>
+                <w:sz w:val="17"/>
+                <w:szCs w:val="17"/>
+              </w:rPr>
+              <w:t xml:space="preserve">M</w:t>
+            </w:r>
+          </w:p>
+        </w:tc>
+        <w:tc>
+          <w:tcPr>
+            <w:tcW w:type="dxa" w:w="3570"/>
+            <w:tcBorders>
+              <w:top w:val="single" w:color="C9D3EE" w:sz="4"/>
+              <w:left w:val="single" w:color="C9D3EE" w:sz="4"/>
+              <w:bottom w:val="single" w:color="C9D3EE" w:sz="4"/>
+              <w:right w:val="single" w:color="C9D3EE" w:sz="4"/>
+            </w:tcBorders>
+            <w:tcMar>
+              <w:top w:type="dxa" w:w="60"/>
+              <w:left w:type="dxa" w:w="100"/>
+              <w:bottom w:type="dxa" w:w="60"/>
+              <w:right w:type="dxa" w:w="100"/>
+            </w:tcMar>
+            <w:vAlign w:val="top"/>
+          </w:tcPr>
+          <w:p>
+            <w:pPr>
+              <w:keepNext w:val="false"/>
+              <w:spacing w:after="10" w:before="10" w:line="252" w:lineRule="auto"/>
+              <w:jc w:val="left"/>
+            </w:pPr>
+            <w:r>
+              <w:rPr>
+                <w:b w:val="false"/>
+                <w:bCs w:val="false"/>
+                <w:sz w:val="17"/>
+                <w:szCs w:val="17"/>
+              </w:rPr>
+              <w:t xml:space="preserve">D110, D113 bis D115</w:t>
+            </w:r>
+          </w:p>
+        </w:tc>
+      </w:tr>
     </w:tbl>
     <w:p>
       <w:pPr>
@@ -35321,7 +35463,7 @@
                 <w:sz w:val="16"/>
                 <w:szCs w:val="16"/>
               </w:rPr>
-              <w:t xml:space="preserve">Zeitplan umgesetzt (31.10.2026, K36); Simulationstool noch zu erstellen</w:t>
+              <w:t xml:space="preserve">Zeitplan umgesetzt (31.10.2026, K36); Biot als Hausaufgabe bestätigt (G45); Simulationstool erstellt (D114)</w:t>
             </w:r>
           </w:p>
         </w:tc>
@@ -35812,6 +35954,983 @@
                 <w:szCs w:val="16"/>
               </w:rPr>
               <w:t xml:space="preserve">Versuch direkt nach g (bricht in Word über zwei Seiten)</w:t>
+            </w:r>
+          </w:p>
+        </w:tc>
+      </w:tr>
+    </w:tbl>
+    <w:p>
+      <w:pPr>
+        <w:pStyle w:val="Heading2"/>
+      </w:pPr>
+      <w:r>
+        <w:t xml:space="preserve">3.13 Indizes der Sammlung und Simulationstool vom 31.10.2026</w:t>
+      </w:r>
+    </w:p>
+    <w:tbl>
+      <w:tblPr>
+        <w:tblW w:type="dxa" w:w="9070"/>
+        <w:tblBorders>
+          <w:top w:val="single" w:color="auto" w:sz="4"/>
+          <w:left w:val="single" w:color="auto" w:sz="4"/>
+          <w:bottom w:val="single" w:color="auto" w:sz="4"/>
+          <w:right w:val="single" w:color="auto" w:sz="4"/>
+          <w:insideH w:val="single" w:color="auto" w:sz="4"/>
+          <w:insideV w:val="single" w:color="auto" w:sz="4"/>
+        </w:tblBorders>
+      </w:tblPr>
+      <w:tblGrid>
+        <w:gridCol w:w="650"/>
+        <w:gridCol w:w="3300"/>
+        <w:gridCol w:w="1450"/>
+        <w:gridCol w:w="650"/>
+        <w:gridCol w:w="1450"/>
+        <w:gridCol w:w="1570"/>
+      </w:tblGrid>
+      <w:tr>
+        <w:trPr>
+          <w:cantSplit/>
+          <w:tblHeader/>
+        </w:trPr>
+        <w:tc>
+          <w:tcPr>
+            <w:tcW w:type="dxa" w:w="650"/>
+            <w:tcBorders>
+              <w:top w:val="single" w:color="C9D3EE" w:sz="4"/>
+              <w:left w:val="single" w:color="C9D3EE" w:sz="4"/>
+              <w:bottom w:val="single" w:color="C9D3EE" w:sz="4"/>
+              <w:right w:val="single" w:color="C9D3EE" w:sz="4"/>
+            </w:tcBorders>
+            <w:shd w:fill="0025AA" w:color="auto" w:val="clear"/>
+            <w:tcMar>
+              <w:top w:type="dxa" w:w="60"/>
+              <w:left w:type="dxa" w:w="100"/>
+              <w:bottom w:type="dxa" w:w="60"/>
+              <w:right w:type="dxa" w:w="100"/>
+            </w:tcMar>
+            <w:vAlign w:val="top"/>
+          </w:tcPr>
+          <w:p>
+            <w:pPr>
+              <w:keepNext w:val="false"/>
+              <w:spacing w:after="10" w:before="10" w:line="252" w:lineRule="auto"/>
+              <w:jc w:val="left"/>
+            </w:pPr>
+            <w:r>
+              <w:rPr>
+                <w:b/>
+                <w:bCs/>
+                <w:color w:val="FFFFFF"/>
+                <w:sz w:val="17"/>
+                <w:szCs w:val="17"/>
+              </w:rPr>
+              <w:t xml:space="preserve">Nr.</w:t>
+            </w:r>
+          </w:p>
+        </w:tc>
+        <w:tc>
+          <w:tcPr>
+            <w:tcW w:type="dxa" w:w="3300"/>
+            <w:tcBorders>
+              <w:top w:val="single" w:color="C9D3EE" w:sz="4"/>
+              <w:left w:val="single" w:color="C9D3EE" w:sz="4"/>
+              <w:bottom w:val="single" w:color="C9D3EE" w:sz="4"/>
+              <w:right w:val="single" w:color="C9D3EE" w:sz="4"/>
+            </w:tcBorders>
+            <w:shd w:fill="0025AA" w:color="auto" w:val="clear"/>
+            <w:tcMar>
+              <w:top w:type="dxa" w:w="60"/>
+              <w:left w:type="dxa" w:w="100"/>
+              <w:bottom w:type="dxa" w:w="60"/>
+              <w:right w:type="dxa" w:w="100"/>
+            </w:tcMar>
+            <w:vAlign w:val="top"/>
+          </w:tcPr>
+          <w:p>
+            <w:pPr>
+              <w:keepNext w:val="false"/>
+              <w:spacing w:after="10" w:before="10" w:line="252" w:lineRule="auto"/>
+              <w:jc w:val="left"/>
+            </w:pPr>
+            <w:r>
+              <w:rPr>
+                <w:b/>
+                <w:bCs/>
+                <w:color w:val="FFFFFF"/>
+                <w:sz w:val="17"/>
+                <w:szCs w:val="17"/>
+              </w:rPr>
+              <w:t xml:space="preserve">Gegenstand und Entscheidung</w:t>
+            </w:r>
+          </w:p>
+        </w:tc>
+        <w:tc>
+          <w:tcPr>
+            <w:tcW w:type="dxa" w:w="1450"/>
+            <w:tcBorders>
+              <w:top w:val="single" w:color="C9D3EE" w:sz="4"/>
+              <w:left w:val="single" w:color="C9D3EE" w:sz="4"/>
+              <w:bottom w:val="single" w:color="C9D3EE" w:sz="4"/>
+              <w:right w:val="single" w:color="C9D3EE" w:sz="4"/>
+            </w:tcBorders>
+            <w:shd w:fill="0025AA" w:color="auto" w:val="clear"/>
+            <w:tcMar>
+              <w:top w:type="dxa" w:w="60"/>
+              <w:left w:type="dxa" w:w="100"/>
+              <w:bottom w:type="dxa" w:w="60"/>
+              <w:right w:type="dxa" w:w="100"/>
+            </w:tcMar>
+            <w:vAlign w:val="top"/>
+          </w:tcPr>
+          <w:p>
+            <w:pPr>
+              <w:keepNext w:val="false"/>
+              <w:spacing w:after="10" w:before="10" w:line="252" w:lineRule="auto"/>
+              <w:jc w:val="left"/>
+            </w:pPr>
+            <w:r>
+              <w:rPr>
+                <w:b/>
+                <w:bCs/>
+                <w:color w:val="FFFFFF"/>
+                <w:sz w:val="17"/>
+                <w:szCs w:val="17"/>
+              </w:rPr>
+              <w:t xml:space="preserve">Grundlage</w:t>
+            </w:r>
+          </w:p>
+        </w:tc>
+        <w:tc>
+          <w:tcPr>
+            <w:tcW w:type="dxa" w:w="650"/>
+            <w:tcBorders>
+              <w:top w:val="single" w:color="C9D3EE" w:sz="4"/>
+              <w:left w:val="single" w:color="C9D3EE" w:sz="4"/>
+              <w:bottom w:val="single" w:color="C9D3EE" w:sz="4"/>
+              <w:right w:val="single" w:color="C9D3EE" w:sz="4"/>
+            </w:tcBorders>
+            <w:shd w:fill="0025AA" w:color="auto" w:val="clear"/>
+            <w:tcMar>
+              <w:top w:type="dxa" w:w="60"/>
+              <w:left w:type="dxa" w:w="100"/>
+              <w:bottom w:type="dxa" w:w="60"/>
+              <w:right w:type="dxa" w:w="100"/>
+            </w:tcMar>
+            <w:vAlign w:val="top"/>
+          </w:tcPr>
+          <w:p>
+            <w:pPr>
+              <w:keepNext w:val="false"/>
+              <w:spacing w:after="10" w:before="10" w:line="252" w:lineRule="auto"/>
+              <w:jc w:val="left"/>
+            </w:pPr>
+            <w:r>
+              <w:rPr>
+                <w:b/>
+                <w:bCs/>
+                <w:color w:val="FFFFFF"/>
+                <w:sz w:val="17"/>
+                <w:szCs w:val="17"/>
+              </w:rPr>
+              <w:t xml:space="preserve">Von</w:t>
+            </w:r>
+          </w:p>
+        </w:tc>
+        <w:tc>
+          <w:tcPr>
+            <w:tcW w:type="dxa" w:w="1450"/>
+            <w:tcBorders>
+              <w:top w:val="single" w:color="C9D3EE" w:sz="4"/>
+              <w:left w:val="single" w:color="C9D3EE" w:sz="4"/>
+              <w:bottom w:val="single" w:color="C9D3EE" w:sz="4"/>
+              <w:right w:val="single" w:color="C9D3EE" w:sz="4"/>
+            </w:tcBorders>
+            <w:shd w:fill="0025AA" w:color="auto" w:val="clear"/>
+            <w:tcMar>
+              <w:top w:type="dxa" w:w="60"/>
+              <w:left w:type="dxa" w:w="100"/>
+              <w:bottom w:type="dxa" w:w="60"/>
+              <w:right w:type="dxa" w:w="100"/>
+            </w:tcMar>
+            <w:vAlign w:val="top"/>
+          </w:tcPr>
+          <w:p>
+            <w:pPr>
+              <w:keepNext w:val="false"/>
+              <w:spacing w:after="10" w:before="10" w:line="252" w:lineRule="auto"/>
+              <w:jc w:val="left"/>
+            </w:pPr>
+            <w:r>
+              <w:rPr>
+                <w:b/>
+                <w:bCs/>
+                <w:color w:val="FFFFFF"/>
+                <w:sz w:val="17"/>
+                <w:szCs w:val="17"/>
+              </w:rPr>
+              <w:t xml:space="preserve">Status</w:t>
+            </w:r>
+          </w:p>
+        </w:tc>
+        <w:tc>
+          <w:tcPr>
+            <w:tcW w:type="dxa" w:w="1570"/>
+            <w:tcBorders>
+              <w:top w:val="single" w:color="C9D3EE" w:sz="4"/>
+              <w:left w:val="single" w:color="C9D3EE" w:sz="4"/>
+              <w:bottom w:val="single" w:color="C9D3EE" w:sz="4"/>
+              <w:right w:val="single" w:color="C9D3EE" w:sz="4"/>
+            </w:tcBorders>
+            <w:shd w:fill="0025AA" w:color="auto" w:val="clear"/>
+            <w:tcMar>
+              <w:top w:type="dxa" w:w="60"/>
+              <w:left w:type="dxa" w:w="100"/>
+              <w:bottom w:type="dxa" w:w="60"/>
+              <w:right w:type="dxa" w:w="100"/>
+            </w:tcMar>
+            <w:vAlign w:val="top"/>
+          </w:tcPr>
+          <w:p>
+            <w:pPr>
+              <w:keepNext w:val="false"/>
+              <w:spacing w:after="10" w:before="10" w:line="252" w:lineRule="auto"/>
+              <w:jc w:val="left"/>
+            </w:pPr>
+            <w:r>
+              <w:rPr>
+                <w:b/>
+                <w:bCs/>
+                <w:color w:val="FFFFFF"/>
+                <w:sz w:val="17"/>
+                <w:szCs w:val="17"/>
+              </w:rPr>
+              <w:t xml:space="preserve">Rückweg</w:t>
+            </w:r>
+          </w:p>
+        </w:tc>
+      </w:tr>
+      <w:tr>
+        <w:trPr>
+          <w:cantSplit/>
+        </w:trPr>
+        <w:tc>
+          <w:tcPr>
+            <w:tcW w:type="dxa" w:w="650"/>
+            <w:tcBorders>
+              <w:top w:val="single" w:color="C9D3EE" w:sz="4"/>
+              <w:left w:val="single" w:color="C9D3EE" w:sz="4"/>
+              <w:bottom w:val="single" w:color="C9D3EE" w:sz="4"/>
+              <w:right w:val="single" w:color="C9D3EE" w:sz="4"/>
+            </w:tcBorders>
+            <w:tcMar>
+              <w:top w:type="dxa" w:w="60"/>
+              <w:left w:type="dxa" w:w="100"/>
+              <w:bottom w:type="dxa" w:w="60"/>
+              <w:right w:type="dxa" w:w="100"/>
+            </w:tcMar>
+            <w:vAlign w:val="top"/>
+          </w:tcPr>
+          <w:p>
+            <w:pPr>
+              <w:keepNext w:val="false"/>
+              <w:spacing w:after="10" w:before="10" w:line="252" w:lineRule="auto"/>
+              <w:jc w:val="left"/>
+            </w:pPr>
+            <w:r>
+              <w:rPr>
+                <w:b/>
+                <w:bCs/>
+                <w:color w:val="0025AA"/>
+                <w:sz w:val="16"/>
+                <w:szCs w:val="16"/>
+              </w:rPr>
+              <w:t xml:space="preserve">D113</w:t>
+            </w:r>
+          </w:p>
+        </w:tc>
+        <w:tc>
+          <w:tcPr>
+            <w:tcW w:type="dxa" w:w="3300"/>
+            <w:tcBorders>
+              <w:top w:val="single" w:color="C9D3EE" w:sz="4"/>
+              <w:left w:val="single" w:color="C9D3EE" w:sz="4"/>
+              <w:bottom w:val="single" w:color="C9D3EE" w:sz="4"/>
+              <w:right w:val="single" w:color="C9D3EE" w:sz="4"/>
+            </w:tcBorders>
+            <w:tcMar>
+              <w:top w:type="dxa" w:w="60"/>
+              <w:left w:type="dxa" w:w="100"/>
+              <w:bottom w:type="dxa" w:w="60"/>
+              <w:right w:type="dxa" w:w="100"/>
+            </w:tcMar>
+            <w:vAlign w:val="top"/>
+          </w:tcPr>
+          <w:p>
+            <w:pPr>
+              <w:keepNext w:val="false"/>
+              <w:spacing w:after="10" w:before="10" w:line="252" w:lineRule="auto"/>
+              <w:jc w:val="left"/>
+            </w:pPr>
+            <w:r>
+              <w:rPr>
+                <w:b w:val="false"/>
+                <w:bCs w:val="false"/>
+                <w:sz w:val="16"/>
+                <w:szCs w:val="16"/>
+              </w:rPr>
+              <w:t xml:space="preserve">Beschreibende Indizes in allen übrigen Tutorien der Sammlung aufrecht wie in der Kaffee-Aufgabe (Ä24): Bezeichnungen (z. B. Eis, Luft, außen, innen, mittel, th, AMOC) aufrecht; Größen und Zahlen als Index bleiben kursiv (p in </w:t>
+            </w:r>
+            <w:r>
+              <w:rPr>
+                <w:b w:val="false"/>
+                <w:bCs w:val="false"/>
+                <w:i/>
+                <w:iCs/>
+                <w:sz w:val="16"/>
+                <w:szCs w:val="16"/>
+              </w:rPr>
+              <w:t xml:space="preserve">c</w:t>
+            </w:r>
+            <w:r>
+              <w:rPr>
+                <w:b w:val="false"/>
+                <w:bCs w:val="false"/>
+                <w:sz w:val="16"/>
+                <w:szCs w:val="16"/>
+                <w:vertAlign w:val="subscript"/>
+              </w:rPr>
+              <w:t xml:space="preserve">p</w:t>
+            </w:r>
+            <w:r>
+              <w:rPr>
+                <w:b w:val="false"/>
+                <w:bCs w:val="false"/>
+                <w:sz w:val="16"/>
+                <w:szCs w:val="16"/>
+              </w:rPr>
+              <w:t xml:space="preserve">, Koordinate </w:t>
+            </w:r>
+            <w:r>
+              <w:rPr>
+                <w:b w:val="false"/>
+                <w:bCs w:val="false"/>
+                <w:i/>
+                <w:iCs/>
+                <w:sz w:val="16"/>
+                <w:szCs w:val="16"/>
+              </w:rPr>
+              <w:t xml:space="preserve">z</w:t>
+            </w:r>
+            <w:r>
+              <w:rPr>
+                <w:b w:val="false"/>
+                <w:bCs w:val="false"/>
+                <w:sz w:val="16"/>
+                <w:szCs w:val="16"/>
+              </w:rPr>
+              <w:t xml:space="preserve">, ∞, α, Ziffern). Gilt für Aufgabentexte, Quellen und Abbildungen. Der Textvergleich belegt, dass sich nur die Schrift geändert hat.</w:t>
+            </w:r>
+          </w:p>
+        </w:tc>
+        <w:tc>
+          <w:tcPr>
+            <w:tcW w:type="dxa" w:w="1450"/>
+            <w:tcBorders>
+              <w:top w:val="single" w:color="C9D3EE" w:sz="4"/>
+              <w:left w:val="single" w:color="C9D3EE" w:sz="4"/>
+              <w:bottom w:val="single" w:color="C9D3EE" w:sz="4"/>
+              <w:right w:val="single" w:color="C9D3EE" w:sz="4"/>
+            </w:tcBorders>
+            <w:tcMar>
+              <w:top w:type="dxa" w:w="60"/>
+              <w:left w:type="dxa" w:w="100"/>
+              <w:bottom w:type="dxa" w:w="60"/>
+              <w:right w:type="dxa" w:w="100"/>
+            </w:tcMar>
+            <w:vAlign w:val="top"/>
+          </w:tcPr>
+          <w:p>
+            <w:pPr>
+              <w:keepNext w:val="false"/>
+              <w:spacing w:after="10" w:before="10" w:line="252" w:lineRule="auto"/>
+              <w:jc w:val="left"/>
+            </w:pPr>
+            <w:r>
+              <w:rPr>
+                <w:b w:val="false"/>
+                <w:bCs w:val="false"/>
+                <w:sz w:val="16"/>
+                <w:szCs w:val="16"/>
+              </w:rPr>
+              <w:t xml:space="preserve">G45</w:t>
+            </w:r>
+          </w:p>
+        </w:tc>
+        <w:tc>
+          <w:tcPr>
+            <w:tcW w:type="dxa" w:w="650"/>
+            <w:tcBorders>
+              <w:top w:val="single" w:color="C9D3EE" w:sz="4"/>
+              <w:left w:val="single" w:color="C9D3EE" w:sz="4"/>
+              <w:bottom w:val="single" w:color="C9D3EE" w:sz="4"/>
+              <w:right w:val="single" w:color="C9D3EE" w:sz="4"/>
+            </w:tcBorders>
+            <w:tcMar>
+              <w:top w:type="dxa" w:w="60"/>
+              <w:left w:type="dxa" w:w="100"/>
+              <w:bottom w:type="dxa" w:w="60"/>
+              <w:right w:type="dxa" w:w="100"/>
+            </w:tcMar>
+            <w:vAlign w:val="top"/>
+          </w:tcPr>
+          <w:p>
+            <w:pPr>
+              <w:keepNext w:val="false"/>
+              <w:spacing w:after="10" w:before="10" w:line="252" w:lineRule="auto"/>
+              <w:jc w:val="left"/>
+            </w:pPr>
+            <w:r>
+              <w:rPr>
+                <w:b w:val="false"/>
+                <w:bCs w:val="false"/>
+                <w:sz w:val="16"/>
+                <w:szCs w:val="16"/>
+              </w:rPr>
+              <w:t xml:space="preserve">TL</w:t>
+            </w:r>
+          </w:p>
+        </w:tc>
+        <w:tc>
+          <w:tcPr>
+            <w:tcW w:type="dxa" w:w="1450"/>
+            <w:tcBorders>
+              <w:top w:val="single" w:color="C9D3EE" w:sz="4"/>
+              <w:left w:val="single" w:color="C9D3EE" w:sz="4"/>
+              <w:bottom w:val="single" w:color="C9D3EE" w:sz="4"/>
+              <w:right w:val="single" w:color="C9D3EE" w:sz="4"/>
+            </w:tcBorders>
+            <w:tcMar>
+              <w:top w:type="dxa" w:w="60"/>
+              <w:left w:type="dxa" w:w="100"/>
+              <w:bottom w:type="dxa" w:w="60"/>
+              <w:right w:type="dxa" w:w="100"/>
+            </w:tcMar>
+            <w:vAlign w:val="top"/>
+          </w:tcPr>
+          <w:p>
+            <w:pPr>
+              <w:keepNext w:val="false"/>
+              <w:spacing w:after="10" w:before="10" w:line="252" w:lineRule="auto"/>
+              <w:jc w:val="left"/>
+            </w:pPr>
+            <w:r>
+              <w:rPr>
+                <w:b w:val="false"/>
+                <w:bCs w:val="false"/>
+                <w:sz w:val="16"/>
+                <w:szCs w:val="16"/>
+              </w:rPr>
+              <w:t xml:space="preserve">umgesetzt (31.10.2026, K37)</w:t>
+            </w:r>
+          </w:p>
+        </w:tc>
+        <w:tc>
+          <w:tcPr>
+            <w:tcW w:type="dxa" w:w="1570"/>
+            <w:tcBorders>
+              <w:top w:val="single" w:color="C9D3EE" w:sz="4"/>
+              <w:left w:val="single" w:color="C9D3EE" w:sz="4"/>
+              <w:bottom w:val="single" w:color="C9D3EE" w:sz="4"/>
+              <w:right w:val="single" w:color="C9D3EE" w:sz="4"/>
+            </w:tcBorders>
+            <w:tcMar>
+              <w:top w:type="dxa" w:w="60"/>
+              <w:left w:type="dxa" w:w="100"/>
+              <w:bottom w:type="dxa" w:w="60"/>
+              <w:right w:type="dxa" w:w="100"/>
+            </w:tcMar>
+            <w:vAlign w:val="top"/>
+          </w:tcPr>
+          <w:p>
+            <w:pPr>
+              <w:keepNext w:val="false"/>
+              <w:spacing w:after="10" w:before="10" w:line="252" w:lineRule="auto"/>
+              <w:jc w:val="left"/>
+            </w:pPr>
+            <w:r>
+              <w:rPr>
+                <w:b w:val="false"/>
+                <w:bCs w:val="false"/>
+                <w:sz w:val="16"/>
+                <w:szCs w:val="16"/>
+              </w:rPr>
+              <w:t xml:space="preserve">Umstellung mit der Gegenprobe des Skripts rückgängig machen (ohne \mathrm-Hülle)</w:t>
+            </w:r>
+          </w:p>
+        </w:tc>
+      </w:tr>
+      <w:tr>
+        <w:trPr>
+          <w:cantSplit/>
+        </w:trPr>
+        <w:tc>
+          <w:tcPr>
+            <w:tcW w:type="dxa" w:w="650"/>
+            <w:tcBorders>
+              <w:top w:val="single" w:color="C9D3EE" w:sz="4"/>
+              <w:left w:val="single" w:color="C9D3EE" w:sz="4"/>
+              <w:bottom w:val="single" w:color="C9D3EE" w:sz="4"/>
+              <w:right w:val="single" w:color="C9D3EE" w:sz="4"/>
+            </w:tcBorders>
+            <w:shd w:fill="F6F8FC" w:color="auto" w:val="clear"/>
+            <w:tcMar>
+              <w:top w:type="dxa" w:w="60"/>
+              <w:left w:type="dxa" w:w="100"/>
+              <w:bottom w:type="dxa" w:w="60"/>
+              <w:right w:type="dxa" w:w="100"/>
+            </w:tcMar>
+            <w:vAlign w:val="top"/>
+          </w:tcPr>
+          <w:p>
+            <w:pPr>
+              <w:keepNext w:val="false"/>
+              <w:spacing w:after="10" w:before="10" w:line="252" w:lineRule="auto"/>
+              <w:jc w:val="left"/>
+            </w:pPr>
+            <w:r>
+              <w:rPr>
+                <w:b/>
+                <w:bCs/>
+                <w:color w:val="0025AA"/>
+                <w:sz w:val="16"/>
+                <w:szCs w:val="16"/>
+              </w:rPr>
+              <w:t xml:space="preserve">D114</w:t>
+            </w:r>
+          </w:p>
+        </w:tc>
+        <w:tc>
+          <w:tcPr>
+            <w:tcW w:type="dxa" w:w="3300"/>
+            <w:tcBorders>
+              <w:top w:val="single" w:color="C9D3EE" w:sz="4"/>
+              <w:left w:val="single" w:color="C9D3EE" w:sz="4"/>
+              <w:bottom w:val="single" w:color="C9D3EE" w:sz="4"/>
+              <w:right w:val="single" w:color="C9D3EE" w:sz="4"/>
+            </w:tcBorders>
+            <w:shd w:fill="F6F8FC" w:color="auto" w:val="clear"/>
+            <w:tcMar>
+              <w:top w:type="dxa" w:w="60"/>
+              <w:left w:type="dxa" w:w="100"/>
+              <w:bottom w:type="dxa" w:w="60"/>
+              <w:right w:type="dxa" w:w="100"/>
+            </w:tcMar>
+            <w:vAlign w:val="top"/>
+          </w:tcPr>
+          <w:p>
+            <w:pPr>
+              <w:keepNext w:val="false"/>
+              <w:spacing w:after="10" w:before="10" w:line="252" w:lineRule="auto"/>
+              <w:jc w:val="left"/>
+            </w:pPr>
+            <w:r>
+              <w:rPr>
+                <w:b w:val="false"/>
+                <w:bCs w:val="false"/>
+                <w:sz w:val="16"/>
+                <w:szCs w:val="16"/>
+              </w:rPr>
+              <w:t xml:space="preserve">Simulationstool für die dritte Ebene der Sitzung: Kaffee_Simulation.html, eine Datei, offline auf Handy und Laptop, mit genau dem Modell aus kaffee_modell.py. Regler: Zeitpunkt der Milchzugabe, Milchtemperatur (2 bis 65 °C), Milch für Tasse 2 bei Raumtemperatur (Grenzfall wie Becher 3), Milchmenge, Raumtemperatur, Becher an oder aus; dazu Anfangstemperatur, Messwert nach 10 min, Kaffeemenge, </w:t>
+            </w:r>
+            <w:r>
+              <w:rPr>
+                <w:b w:val="false"/>
+                <w:bCs w:val="false"/>
+                <w:i/>
+                <w:iCs/>
+                <w:sz w:val="16"/>
+                <w:szCs w:val="16"/>
+              </w:rPr>
+              <w:t xml:space="preserve">kA</w:t>
+            </w:r>
+            <w:r>
+              <w:rPr>
+                <w:b w:val="false"/>
+                <w:bCs w:val="false"/>
+                <w:sz w:val="16"/>
+                <w:szCs w:val="16"/>
+              </w:rPr>
+              <w:t xml:space="preserve"> von Tasse 1 relativ und Bechermasse. Anzeige: Verlauf beider Tassen, Schnittpunkt, Endtemperaturen, Unterschied, abgegebene Wärme, </w:t>
+            </w:r>
+            <w:r>
+              <w:rPr>
+                <w:b w:val="false"/>
+                <w:bCs w:val="false"/>
+                <w:i/>
+                <w:iCs/>
+                <w:sz w:val="16"/>
+                <w:szCs w:val="16"/>
+              </w:rPr>
+              <w:t xml:space="preserve">kA</w:t>
+            </w:r>
+            <w:r>
+              <w:rPr>
+                <w:b w:val="false"/>
+                <w:bCs w:val="false"/>
+                <w:sz w:val="16"/>
+                <w:szCs w:val="16"/>
+              </w:rPr>
+              <w:t xml:space="preserve">. Messwerte aus dem Versuch als Punkte im Diagramm, Übernahme in die Einstellungen. Vier Fragen im Werkzeug und mit erwarteten Antworten in den Hinweisen; am Aufgabenblatt nichts geändert.</w:t>
+            </w:r>
+          </w:p>
+        </w:tc>
+        <w:tc>
+          <w:tcPr>
+            <w:tcW w:type="dxa" w:w="1450"/>
+            <w:tcBorders>
+              <w:top w:val="single" w:color="C9D3EE" w:sz="4"/>
+              <w:left w:val="single" w:color="C9D3EE" w:sz="4"/>
+              <w:bottom w:val="single" w:color="C9D3EE" w:sz="4"/>
+              <w:right w:val="single" w:color="C9D3EE" w:sz="4"/>
+            </w:tcBorders>
+            <w:shd w:fill="F6F8FC" w:color="auto" w:val="clear"/>
+            <w:tcMar>
+              <w:top w:type="dxa" w:w="60"/>
+              <w:left w:type="dxa" w:w="100"/>
+              <w:bottom w:type="dxa" w:w="60"/>
+              <w:right w:type="dxa" w:w="100"/>
+            </w:tcMar>
+            <w:vAlign w:val="top"/>
+          </w:tcPr>
+          <w:p>
+            <w:pPr>
+              <w:keepNext w:val="false"/>
+              <w:spacing w:after="10" w:before="10" w:line="252" w:lineRule="auto"/>
+              <w:jc w:val="left"/>
+            </w:pPr>
+            <w:r>
+              <w:rPr>
+                <w:b w:val="false"/>
+                <w:bCs w:val="false"/>
+                <w:sz w:val="16"/>
+                <w:szCs w:val="16"/>
+              </w:rPr>
+              <w:t xml:space="preserve">G44, G45</w:t>
+            </w:r>
+          </w:p>
+        </w:tc>
+        <w:tc>
+          <w:tcPr>
+            <w:tcW w:type="dxa" w:w="650"/>
+            <w:tcBorders>
+              <w:top w:val="single" w:color="C9D3EE" w:sz="4"/>
+              <w:left w:val="single" w:color="C9D3EE" w:sz="4"/>
+              <w:bottom w:val="single" w:color="C9D3EE" w:sz="4"/>
+              <w:right w:val="single" w:color="C9D3EE" w:sz="4"/>
+            </w:tcBorders>
+            <w:shd w:fill="F6F8FC" w:color="auto" w:val="clear"/>
+            <w:tcMar>
+              <w:top w:type="dxa" w:w="60"/>
+              <w:left w:type="dxa" w:w="100"/>
+              <w:bottom w:type="dxa" w:w="60"/>
+              <w:right w:type="dxa" w:w="100"/>
+            </w:tcMar>
+            <w:vAlign w:val="top"/>
+          </w:tcPr>
+          <w:p>
+            <w:pPr>
+              <w:keepNext w:val="false"/>
+              <w:spacing w:after="10" w:before="10" w:line="252" w:lineRule="auto"/>
+              <w:jc w:val="left"/>
+            </w:pPr>
+            <w:r>
+              <w:rPr>
+                <w:b w:val="false"/>
+                <w:bCs w:val="false"/>
+                <w:sz w:val="16"/>
+                <w:szCs w:val="16"/>
+              </w:rPr>
+              <w:t xml:space="preserve">TL</w:t>
+            </w:r>
+          </w:p>
+        </w:tc>
+        <w:tc>
+          <w:tcPr>
+            <w:tcW w:type="dxa" w:w="1450"/>
+            <w:tcBorders>
+              <w:top w:val="single" w:color="C9D3EE" w:sz="4"/>
+              <w:left w:val="single" w:color="C9D3EE" w:sz="4"/>
+              <w:bottom w:val="single" w:color="C9D3EE" w:sz="4"/>
+              <w:right w:val="single" w:color="C9D3EE" w:sz="4"/>
+            </w:tcBorders>
+            <w:shd w:fill="F6F8FC" w:color="auto" w:val="clear"/>
+            <w:tcMar>
+              <w:top w:type="dxa" w:w="60"/>
+              <w:left w:type="dxa" w:w="100"/>
+              <w:bottom w:type="dxa" w:w="60"/>
+              <w:right w:type="dxa" w:w="100"/>
+            </w:tcMar>
+            <w:vAlign w:val="top"/>
+          </w:tcPr>
+          <w:p>
+            <w:pPr>
+              <w:keepNext w:val="false"/>
+              <w:spacing w:after="10" w:before="10" w:line="252" w:lineRule="auto"/>
+              <w:jc w:val="left"/>
+            </w:pPr>
+            <w:r>
+              <w:rPr>
+                <w:b w:val="false"/>
+                <w:bCs w:val="false"/>
+                <w:sz w:val="16"/>
+                <w:szCs w:val="16"/>
+              </w:rPr>
+              <w:t xml:space="preserve">umgesetzt (31.10.2026, K37); Prüfung durch Codex offen (D115)</w:t>
+            </w:r>
+          </w:p>
+        </w:tc>
+        <w:tc>
+          <w:tcPr>
+            <w:tcW w:type="dxa" w:w="1570"/>
+            <w:tcBorders>
+              <w:top w:val="single" w:color="C9D3EE" w:sz="4"/>
+              <w:left w:val="single" w:color="C9D3EE" w:sz="4"/>
+              <w:bottom w:val="single" w:color="C9D3EE" w:sz="4"/>
+              <w:right w:val="single" w:color="C9D3EE" w:sz="4"/>
+            </w:tcBorders>
+            <w:shd w:fill="F6F8FC" w:color="auto" w:val="clear"/>
+            <w:tcMar>
+              <w:top w:type="dxa" w:w="60"/>
+              <w:left w:type="dxa" w:w="100"/>
+              <w:bottom w:type="dxa" w:w="60"/>
+              <w:right w:type="dxa" w:w="100"/>
+            </w:tcMar>
+            <w:vAlign w:val="top"/>
+          </w:tcPr>
+          <w:p>
+            <w:pPr>
+              <w:keepNext w:val="false"/>
+              <w:spacing w:after="10" w:before="10" w:line="252" w:lineRule="auto"/>
+              <w:jc w:val="left"/>
+            </w:pPr>
+            <w:r>
+              <w:rPr>
+                <w:b w:val="false"/>
+                <w:bCs w:val="false"/>
+                <w:sz w:val="16"/>
+                <w:szCs w:val="16"/>
+              </w:rPr>
+              <w:t xml:space="preserve">Simulation an der Tafel mit den Abbildungen der Lösung</w:t>
+            </w:r>
+          </w:p>
+        </w:tc>
+      </w:tr>
+      <w:tr>
+        <w:trPr>
+          <w:cantSplit/>
+        </w:trPr>
+        <w:tc>
+          <w:tcPr>
+            <w:tcW w:type="dxa" w:w="650"/>
+            <w:tcBorders>
+              <w:top w:val="single" w:color="C9D3EE" w:sz="4"/>
+              <w:left w:val="single" w:color="C9D3EE" w:sz="4"/>
+              <w:bottom w:val="single" w:color="C9D3EE" w:sz="4"/>
+              <w:right w:val="single" w:color="C9D3EE" w:sz="4"/>
+            </w:tcBorders>
+            <w:tcMar>
+              <w:top w:type="dxa" w:w="60"/>
+              <w:left w:type="dxa" w:w="100"/>
+              <w:bottom w:type="dxa" w:w="60"/>
+              <w:right w:type="dxa" w:w="100"/>
+            </w:tcMar>
+            <w:vAlign w:val="top"/>
+          </w:tcPr>
+          <w:p>
+            <w:pPr>
+              <w:keepNext w:val="false"/>
+              <w:spacing w:after="10" w:before="10" w:line="252" w:lineRule="auto"/>
+              <w:jc w:val="left"/>
+            </w:pPr>
+            <w:r>
+              <w:rPr>
+                <w:b/>
+                <w:bCs/>
+                <w:color w:val="0025AA"/>
+                <w:sz w:val="16"/>
+                <w:szCs w:val="16"/>
+              </w:rPr>
+              <w:t xml:space="preserve">D115</w:t>
+            </w:r>
+          </w:p>
+        </w:tc>
+        <w:tc>
+          <w:tcPr>
+            <w:tcW w:type="dxa" w:w="3300"/>
+            <w:tcBorders>
+              <w:top w:val="single" w:color="C9D3EE" w:sz="4"/>
+              <w:left w:val="single" w:color="C9D3EE" w:sz="4"/>
+              <w:bottom w:val="single" w:color="C9D3EE" w:sz="4"/>
+              <w:right w:val="single" w:color="C9D3EE" w:sz="4"/>
+            </w:tcBorders>
+            <w:tcMar>
+              <w:top w:type="dxa" w:w="60"/>
+              <w:left w:type="dxa" w:w="100"/>
+              <w:bottom w:type="dxa" w:w="60"/>
+              <w:right w:type="dxa" w:w="100"/>
+            </w:tcMar>
+            <w:vAlign w:val="top"/>
+          </w:tcPr>
+          <w:p>
+            <w:pPr>
+              <w:keepNext w:val="false"/>
+              <w:spacing w:after="10" w:before="10" w:line="252" w:lineRule="auto"/>
+              <w:jc w:val="left"/>
+            </w:pPr>
+            <w:r>
+              <w:rPr>
+                <w:b w:val="false"/>
+                <w:bCs w:val="false"/>
+                <w:sz w:val="16"/>
+                <w:szCs w:val="16"/>
+              </w:rPr>
+              <w:t xml:space="preserve">Unabhängige Prüfung des Simulationstools durch Codex (Rolle X3, dritter Auftrag in AGENTS.md): eigene Nachrechnung ohne das Modell des Werkzeugs, Bedienung im Browser, Lösbarkeit der Fragen ohne Hilfe. Danach Übergabe und Pull Request.</w:t>
+            </w:r>
+          </w:p>
+        </w:tc>
+        <w:tc>
+          <w:tcPr>
+            <w:tcW w:type="dxa" w:w="1450"/>
+            <w:tcBorders>
+              <w:top w:val="single" w:color="C9D3EE" w:sz="4"/>
+              <w:left w:val="single" w:color="C9D3EE" w:sz="4"/>
+              <w:bottom w:val="single" w:color="C9D3EE" w:sz="4"/>
+              <w:right w:val="single" w:color="C9D3EE" w:sz="4"/>
+            </w:tcBorders>
+            <w:tcMar>
+              <w:top w:type="dxa" w:w="60"/>
+              <w:left w:type="dxa" w:w="100"/>
+              <w:bottom w:type="dxa" w:w="60"/>
+              <w:right w:type="dxa" w:w="100"/>
+            </w:tcMar>
+            <w:vAlign w:val="top"/>
+          </w:tcPr>
+          <w:p>
+            <w:pPr>
+              <w:keepNext w:val="false"/>
+              <w:spacing w:after="10" w:before="10" w:line="252" w:lineRule="auto"/>
+              <w:jc w:val="left"/>
+            </w:pPr>
+            <w:r>
+              <w:rPr>
+                <w:b w:val="false"/>
+                <w:bCs w:val="false"/>
+                <w:sz w:val="16"/>
+                <w:szCs w:val="16"/>
+              </w:rPr>
+              <w:t xml:space="preserve">G45</w:t>
+            </w:r>
+          </w:p>
+        </w:tc>
+        <w:tc>
+          <w:tcPr>
+            <w:tcW w:type="dxa" w:w="650"/>
+            <w:tcBorders>
+              <w:top w:val="single" w:color="C9D3EE" w:sz="4"/>
+              <w:left w:val="single" w:color="C9D3EE" w:sz="4"/>
+              <w:bottom w:val="single" w:color="C9D3EE" w:sz="4"/>
+              <w:right w:val="single" w:color="C9D3EE" w:sz="4"/>
+            </w:tcBorders>
+            <w:tcMar>
+              <w:top w:type="dxa" w:w="60"/>
+              <w:left w:type="dxa" w:w="100"/>
+              <w:bottom w:type="dxa" w:w="60"/>
+              <w:right w:type="dxa" w:w="100"/>
+            </w:tcMar>
+            <w:vAlign w:val="top"/>
+          </w:tcPr>
+          <w:p>
+            <w:pPr>
+              <w:keepNext w:val="false"/>
+              <w:spacing w:after="10" w:before="10" w:line="252" w:lineRule="auto"/>
+              <w:jc w:val="left"/>
+            </w:pPr>
+            <w:r>
+              <w:rPr>
+                <w:b w:val="false"/>
+                <w:bCs w:val="false"/>
+                <w:sz w:val="16"/>
+                <w:szCs w:val="16"/>
+              </w:rPr>
+              <w:t xml:space="preserve">TL</w:t>
+            </w:r>
+          </w:p>
+        </w:tc>
+        <w:tc>
+          <w:tcPr>
+            <w:tcW w:type="dxa" w:w="1450"/>
+            <w:tcBorders>
+              <w:top w:val="single" w:color="C9D3EE" w:sz="4"/>
+              <w:left w:val="single" w:color="C9D3EE" w:sz="4"/>
+              <w:bottom w:val="single" w:color="C9D3EE" w:sz="4"/>
+              <w:right w:val="single" w:color="C9D3EE" w:sz="4"/>
+            </w:tcBorders>
+            <w:tcMar>
+              <w:top w:type="dxa" w:w="60"/>
+              <w:left w:type="dxa" w:w="100"/>
+              <w:bottom w:type="dxa" w:w="60"/>
+              <w:right w:type="dxa" w:w="100"/>
+            </w:tcMar>
+            <w:vAlign w:val="top"/>
+          </w:tcPr>
+          <w:p>
+            <w:pPr>
+              <w:keepNext w:val="false"/>
+              <w:spacing w:after="10" w:before="10" w:line="252" w:lineRule="auto"/>
+              <w:jc w:val="left"/>
+            </w:pPr>
+            <w:r>
+              <w:rPr>
+                <w:b w:val="false"/>
+                <w:bCs w:val="false"/>
+                <w:sz w:val="16"/>
+                <w:szCs w:val="16"/>
+              </w:rPr>
+              <w:t xml:space="preserve">vorbereitet</w:t>
+            </w:r>
+          </w:p>
+        </w:tc>
+        <w:tc>
+          <w:tcPr>
+            <w:tcW w:type="dxa" w:w="1570"/>
+            <w:tcBorders>
+              <w:top w:val="single" w:color="C9D3EE" w:sz="4"/>
+              <w:left w:val="single" w:color="C9D3EE" w:sz="4"/>
+              <w:bottom w:val="single" w:color="C9D3EE" w:sz="4"/>
+              <w:right w:val="single" w:color="C9D3EE" w:sz="4"/>
+            </w:tcBorders>
+            <w:tcMar>
+              <w:top w:type="dxa" w:w="60"/>
+              <w:left w:type="dxa" w:w="100"/>
+              <w:bottom w:type="dxa" w:w="60"/>
+              <w:right w:type="dxa" w:w="100"/>
+            </w:tcMar>
+            <w:vAlign w:val="top"/>
+          </w:tcPr>
+          <w:p>
+            <w:pPr>
+              <w:keepNext w:val="false"/>
+              <w:spacing w:after="10" w:before="10" w:line="252" w:lineRule="auto"/>
+              <w:jc w:val="left"/>
+            </w:pPr>
+            <w:r>
+              <w:rPr>
+                <w:b w:val="false"/>
+                <w:bCs w:val="false"/>
+                <w:sz w:val="16"/>
+                <w:szCs w:val="16"/>
+              </w:rPr>
+              <w:t xml:space="preserve">ohne zweite Prüfung einsetzen</w:t>
             </w:r>
           </w:p>
         </w:tc>
@@ -35962,21 +37081,7 @@
         <w:jc w:val="left"/>
       </w:pPr>
       <w:r>
-        <w:t xml:space="preserve">Simulationstool für die Kaffee-Sitzung erstellen (D110)</w:t>
-      </w:r>
-    </w:p>
-    <w:p>
-      <w:pPr>
-        <w:pStyle w:val="ListParagraph"/>
-        <w:numPr>
-          <w:ilvl w:val="0"/>
-          <w:numId w:val="2"/>
-        </w:numPr>
-        <w:spacing w:after="30" w:before="30" w:line="264" w:lineRule="auto"/>
-        <w:jc w:val="left"/>
-      </w:pPr>
-      <w:r>
-        <w:t xml:space="preserve">Indexschreibweise der übrigen Tutorien der Sammlung an die Kaffee-Aufgabe angleichen (beschreibende Indizes aufrecht, Ä24), falls gewünscht</w:t>
+        <w:t xml:space="preserve">Prüfung des Simulationstools durch Codex (Rolle X3), danach Übergabe und Pull Request (D115, K37)</w:t>
       </w:r>
     </w:p>
     <w:p>
@@ -37480,6 +38585,114 @@
                 <w:szCs w:val="17"/>
               </w:rPr>
               <w:t xml:space="preserve">Abnahme durch Codex und Konzept der Sitzung: Grundlagen G43 und G44, Entscheidungen D110 bis D112 (Abschnitt 3.12), Status von D67 angepasst, offene Punkte aktualisiert</w:t>
+            </w:r>
+          </w:p>
+        </w:tc>
+      </w:tr>
+      <w:tr>
+        <w:trPr>
+          <w:cantSplit/>
+        </w:trPr>
+        <w:tc>
+          <w:tcPr>
+            <w:tcW w:type="dxa" w:w="1200"/>
+            <w:tcBorders>
+              <w:top w:val="single" w:color="C9D3EE" w:sz="4"/>
+              <w:left w:val="single" w:color="C9D3EE" w:sz="4"/>
+              <w:bottom w:val="single" w:color="C9D3EE" w:sz="4"/>
+              <w:right w:val="single" w:color="C9D3EE" w:sz="4"/>
+            </w:tcBorders>
+            <w:tcMar>
+              <w:top w:type="dxa" w:w="60"/>
+              <w:left w:type="dxa" w:w="100"/>
+              <w:bottom w:type="dxa" w:w="60"/>
+              <w:right w:type="dxa" w:w="100"/>
+            </w:tcMar>
+            <w:vAlign w:val="top"/>
+          </w:tcPr>
+          <w:p>
+            <w:pPr>
+              <w:keepNext w:val="false"/>
+              <w:spacing w:after="10" w:before="10" w:line="252" w:lineRule="auto"/>
+              <w:jc w:val="left"/>
+            </w:pPr>
+            <w:r>
+              <w:rPr>
+                <w:b/>
+                <w:bCs/>
+                <w:color w:val="0025AA"/>
+                <w:sz w:val="17"/>
+                <w:szCs w:val="17"/>
+              </w:rPr>
+              <w:t xml:space="preserve">12</w:t>
+            </w:r>
+          </w:p>
+        </w:tc>
+        <w:tc>
+          <w:tcPr>
+            <w:tcW w:type="dxa" w:w="1500"/>
+            <w:tcBorders>
+              <w:top w:val="single" w:color="C9D3EE" w:sz="4"/>
+              <w:left w:val="single" w:color="C9D3EE" w:sz="4"/>
+              <w:bottom w:val="single" w:color="C9D3EE" w:sz="4"/>
+              <w:right w:val="single" w:color="C9D3EE" w:sz="4"/>
+            </w:tcBorders>
+            <w:tcMar>
+              <w:top w:type="dxa" w:w="60"/>
+              <w:left w:type="dxa" w:w="100"/>
+              <w:bottom w:type="dxa" w:w="60"/>
+              <w:right w:type="dxa" w:w="100"/>
+            </w:tcMar>
+            <w:vAlign w:val="top"/>
+          </w:tcPr>
+          <w:p>
+            <w:pPr>
+              <w:keepNext w:val="false"/>
+              <w:spacing w:after="10" w:before="10" w:line="252" w:lineRule="auto"/>
+              <w:jc w:val="left"/>
+            </w:pPr>
+            <w:r>
+              <w:rPr>
+                <w:b w:val="false"/>
+                <w:bCs w:val="false"/>
+                <w:sz w:val="17"/>
+                <w:szCs w:val="17"/>
+              </w:rPr>
+              <w:t xml:space="preserve">31.10.2026</w:t>
+            </w:r>
+          </w:p>
+        </w:tc>
+        <w:tc>
+          <w:tcPr>
+            <w:tcW w:type="dxa" w:w="6370"/>
+            <w:tcBorders>
+              <w:top w:val="single" w:color="C9D3EE" w:sz="4"/>
+              <w:left w:val="single" w:color="C9D3EE" w:sz="4"/>
+              <w:bottom w:val="single" w:color="C9D3EE" w:sz="4"/>
+              <w:right w:val="single" w:color="C9D3EE" w:sz="4"/>
+            </w:tcBorders>
+            <w:tcMar>
+              <w:top w:type="dxa" w:w="60"/>
+              <w:left w:type="dxa" w:w="100"/>
+              <w:bottom w:type="dxa" w:w="60"/>
+              <w:right w:type="dxa" w:w="100"/>
+            </w:tcMar>
+            <w:vAlign w:val="top"/>
+          </w:tcPr>
+          <w:p>
+            <w:pPr>
+              <w:keepNext w:val="false"/>
+              <w:spacing w:after="10" w:before="10" w:line="252" w:lineRule="auto"/>
+              <w:jc w:val="left"/>
+            </w:pPr>
+            <w:r>
+              <w:rPr>
+                <w:b w:val="false"/>
+                <w:bCs w:val="false"/>
+                <w:sz w:val="17"/>
+                <w:szCs w:val="17"/>
+              </w:rPr>
+              <w:t xml:space="preserve">Indizes der Sammlung und Simulationstool: Grundlage G45, Entscheidungen D113 bis D115 (Abschnitt 3.13), Status von D110 angepasst, offene Punkte aktualisiert</w:t>
             </w:r>
           </w:p>
         </w:tc>

</xml_diff>